<commit_message>
Remove referencias Lunaris da pagina Lunya
</commit_message>
<xml_diff>
--- a/Lunya_Termos_Privacidade_v1.0.docx
+++ b/Lunya_Termos_Privacidade_v1.0.docx
@@ -41,7 +41,7 @@
           <w:sz w:val="52"/>
           <w:szCs w:val="52"/>
         </w:rPr>
-        <w:t xml:space="preserve">LUNARIS TECH</w:t>
+        <w:t xml:space="preserve">LU SYSTEM</w:t>
       </w:r>
     </w:p>
     <w:p>
@@ -199,7 +199,7 @@
           <w:sz w:val="20"/>
           <w:szCs w:val="20"/>
         </w:rPr>
-        <w:t xml:space="preserve">Lunaris Tech  •  lunaristech7@gmail.com</w:t>
+        <w:t xml:space="preserve">Lu System  •  contato@lusystem.com.br</w:t>
       </w:r>
     </w:p>
     <w:p>
@@ -259,7 +259,7 @@
           <w:sz w:val="22"/>
           <w:szCs w:val="22"/>
         </w:rPr>
-        <w:t xml:space="preserve">Ao instalar, acessar ou utilizar o aplicativo Lunya (desktop) ou LunyaMB (Android), desenvolvido e mantido pela Lunaris Tech, você declara que leu, compreendeu e concorda com os presentes Termos de Uso.</w:t>
+        <w:t xml:space="preserve">Ao instalar, acessar ou utilizar o aplicativo Lunya (desktop) ou LunyaMB (Android), desenvolvido e mantido pela Lu System, você declara que leu, compreendeu e concorda com os presentes Termos de Uso.</w:t>
       </w:r>
     </w:p>
     <w:p>
@@ -289,7 +289,7 @@
           <w:sz w:val="22"/>
           <w:szCs w:val="22"/>
         </w:rPr>
-        <w:t xml:space="preserve">Estes Termos aplicam-se a todas as versões do produto, incluindo atualizações futuras. A Lunaris Tech reserva-se o direito de modificar estes Termos a qualquer momento, notificando os usuários por meio do próprio aplicativo.</w:t>
+        <w:t xml:space="preserve">Estes Termos aplicam-se a todas as versões do produto, incluindo atualizações futuras. A Lu System reserva-se o direito de modificar estes Termos a qualquer momento, notificando os usuários por meio do próprio aplicativo.</w:t>
       </w:r>
     </w:p>
     <w:p>
@@ -439,7 +439,7 @@
           <w:sz w:val="22"/>
           <w:szCs w:val="22"/>
         </w:rPr>
-        <w:t xml:space="preserve">O serviço é de uso exclusivamente pessoal e destina-se a pessoas físicas que desejam organizar suas próprias finanças. Não é permitido o uso do aplicativo para fins comerciais, contábeis profissionais ou em nome de terceiros sem autorização expressa da Lunaris Tech.</w:t>
+        <w:t xml:space="preserve">O serviço é de uso exclusivamente pessoal e destina-se a pessoas físicas que desejam organizar suas próprias finanças. Não é permitido o uso do aplicativo para fins comerciais, contábeis profissionais ou em nome de terceiros sem autorização expressa da Lu System.</w:t>
       </w:r>
     </w:p>
     <w:p>
@@ -520,7 +520,7 @@
           <w:sz w:val="22"/>
           <w:szCs w:val="22"/>
         </w:rPr>
-        <w:t xml:space="preserve">O usuário é o único responsável pela confidencialidade de suas credenciais de acesso. A Lunaris Tech não solicita senhas por nenhum meio. Em caso de suspeita de acesso não autorizado, o usuário deve alterar sua senha imediatamente e notificar a Lunaris Tech pelo e-mail lunaristech7@gmail.com.</w:t>
+        <w:t xml:space="preserve">O usuário é o único responsável pela confidencialidade de suas credenciais de acesso. A Lu System não solicita senhas por nenhum meio. Em caso de suspeita de acesso não autorizado, o usuário deve alterar sua senha imediatamente e notificar a Lu System pelo e-mail contato@lusystem.com.br.</w:t>
       </w:r>
     </w:p>
     <w:p>
@@ -603,7 +603,7 @@
           <w:sz w:val="22"/>
           <w:szCs w:val="22"/>
         </w:rPr>
-        <w:t xml:space="preserve">Tentar obter acesso não autorizado a sistemas, contas de outros usuários ou infraestrutura da Lunaris Tech;</w:t>
+        <w:t xml:space="preserve">Tentar obter acesso não autorizado a sistemas, contas de outros usuários ou infraestrutura da Lu System;</w:t>
       </w:r>
     </w:p>
     <w:p>
@@ -711,7 +711,7 @@
           <w:sz w:val="22"/>
           <w:szCs w:val="22"/>
         </w:rPr>
-        <w:t xml:space="preserve">O Lunya é uma ferramenta de organização financeira pessoal. As informações exibidas no aplicativo são inseridas pelo próprio usuário ou importadas de arquivos fornecidos por ele. A Lunaris Tech não se responsabiliza por:</w:t>
+        <w:t xml:space="preserve">O Lunya é uma ferramenta de organização financeira pessoal. As informações exibidas no aplicativo são inseridas pelo próprio usuário ou importadas de arquivos fornecidos por ele. A Lu System não se responsabiliza por:</w:t>
       </w:r>
     </w:p>
     <w:p>
@@ -842,7 +842,7 @@
           <w:sz w:val="22"/>
           <w:szCs w:val="22"/>
         </w:rPr>
-        <w:t xml:space="preserve">Todo o conteúdo do aplicativo Lunya e LunyaMB — incluindo, mas não se limitando a: código-fonte, design, logotipo, marca Lunaris Tech, textos, gráficos e componentes de interface — é de propriedade exclusiva da Lunaris Tech e está protegido pelas leis brasileiras e internacionais de propriedade intelectual.</w:t>
+        <w:t xml:space="preserve">Todo o conteúdo do aplicativo Lunya e LunyaMB — incluindo, mas não se limitando a: código-fonte, design, logotipo, marca Lu System, textos, gráficos e componentes de interface — é de propriedade exclusiva da Lu System e está protegido pelas leis brasileiras e internacionais de propriedade intelectual.</w:t>
       </w:r>
     </w:p>
     <w:p>
@@ -889,22 +889,22 @@
           <w:sz w:val="22"/>
           <w:szCs w:val="22"/>
         </w:rPr>
-        <w:t xml:space="preserve">A Lunaris Tech emprega seus melhores esforços para manter o aplicativo disponível continuamente. No entanto, não garante disponibilidade ininterrupta e não se responsabiliza por interrupções causadas por manutenção, falhas técnicas, problemas de conectividade, ações de terceiros (como Firebase ou provedores de internet) ou outros fatores fora do seu controle.</w:t>
-      </w:r>
-    </w:p>
-    <w:p>
-      <w:pPr>
-        <w:spacing w:after="80" w:before="80"/>
-        <w:jc w:val="both"/>
-      </w:pPr>
-      <w:r>
-        <w:rPr>
-          <w:rFonts w:ascii="Arial" w:cs="Arial" w:eastAsia="Arial" w:hAnsi="Arial"/>
-          <w:color w:val="1E293B"/>
-          <w:sz w:val="22"/>
-          <w:szCs w:val="22"/>
-        </w:rPr>
-        <w:t xml:space="preserve">A Lunaris Tech reserva-se o direito de modificar, suspender ou descontinuar qualquer funcionalidade do aplicativo a qualquer momento, com ou sem aviso prévio, sem que isso gere qualquer direito de indenização ao usuário.</w:t>
+        <w:t xml:space="preserve">A Lu System emprega seus melhores esforços para manter o aplicativo disponível continuamente. No entanto, não garante disponibilidade ininterrupta e não se responsabiliza por interrupções causadas por manutenção, falhas técnicas, problemas de conectividade, ações de terceiros (como Firebase ou provedores de internet) ou outros fatores fora do seu controle.</w:t>
+      </w:r>
+    </w:p>
+    <w:p>
+      <w:pPr>
+        <w:spacing w:after="80" w:before="80"/>
+        <w:jc w:val="both"/>
+      </w:pPr>
+      <w:r>
+        <w:rPr>
+          <w:rFonts w:ascii="Arial" w:cs="Arial" w:eastAsia="Arial" w:hAnsi="Arial"/>
+          <w:color w:val="1E293B"/>
+          <w:sz w:val="22"/>
+          <w:szCs w:val="22"/>
+        </w:rPr>
+        <w:t xml:space="preserve">A Lu System reserva-se o direito de modificar, suspender ou descontinuar qualquer funcionalidade do aplicativo a qualquer momento, com ou sem aviso prévio, sem que isso gere qualquer direito de indenização ao usuário.</w:t>
       </w:r>
     </w:p>
     <w:p>
@@ -936,7 +936,7 @@
           <w:sz w:val="22"/>
           <w:szCs w:val="22"/>
         </w:rPr>
-        <w:t xml:space="preserve">Na máxima extensão permitida pela legislação aplicável, a Lunaris Tech não será responsável por danos indiretos, incidentais, especiais, consequenciais ou punitivos, incluindo perda de dados, lucros cessantes ou interrupção de negócios, decorrentes do uso ou impossibilidade de uso do aplicativo.</w:t>
+        <w:t xml:space="preserve">Na máxima extensão permitida pela legislação aplicável, a Lu System não será responsável por danos indiretos, incidentais, especiais, consequenciais ou punitivos, incluindo perda de dados, lucros cessantes ou interrupção de negócios, decorrentes do uso ou impossibilidade de uso do aplicativo.</w:t>
       </w:r>
     </w:p>
     <w:p>
@@ -1000,7 +1000,7 @@
           <w:sz w:val="22"/>
           <w:szCs w:val="22"/>
         </w:rPr>
-        <w:t xml:space="preserve">Para dúvidas, solicitações ou comunicações relacionadas a estes Termos de Uso, o usuário pode entrar em contato com a Lunaris Tech pelo e-mail:</w:t>
+        <w:t xml:space="preserve">Para dúvidas, solicitações ou comunicações relacionadas a estes Termos de Uso, o usuário pode entrar em contato com a Lu System pelo e-mail:</w:t>
       </w:r>
     </w:p>
     <w:p>
@@ -1025,7 +1025,7 @@
           <w:sz w:val="24"/>
           <w:szCs w:val="24"/>
         </w:rPr>
-        <w:t xml:space="preserve">lunaristech7@gmail.com</w:t>
+        <w:t xml:space="preserve">contato@lusystem.com.br</w:t>
       </w:r>
     </w:p>
     <w:p>
@@ -1089,7 +1089,7 @@
           <w:sz w:val="22"/>
           <w:szCs w:val="22"/>
         </w:rPr>
-        <w:t xml:space="preserve">A Lunaris Tech tem o compromisso de proteger a privacidade e os dados pessoais dos seus usuários. Esta Política de Privacidade descreve quais dados são coletados, como são utilizados, armazenados e protegidos no contexto do uso do Lunya (desktop) e LunyaMB (Android).</w:t>
+        <w:t xml:space="preserve">A Lu System tem o compromisso de proteger a privacidade e os dados pessoais dos seus usuários. Esta Política de Privacidade descreve quais dados são coletados, como são utilizados, armazenados e protegidos no contexto do uso do Lunya (desktop) e LunyaMB (Android).</w:t>
       </w:r>
     </w:p>
     <w:p>
@@ -1589,7 +1589,7 @@
           <w:sz w:val="22"/>
           <w:szCs w:val="22"/>
         </w:rPr>
-        <w:t xml:space="preserve">O tratamento dos dados pessoais realizado pela Lunaris Tech está fundamentado nas seguintes bases legais previstas na LGPD:</w:t>
+        <w:t xml:space="preserve">O tratamento dos dados pessoais realizado pela Lu System está fundamentado nas seguintes bases legais previstas na LGPD:</w:t>
       </w:r>
     </w:p>
     <w:p>
@@ -1714,7 +1714,7 @@
           <w:sz w:val="22"/>
           <w:szCs w:val="22"/>
         </w:rPr>
-        <w:t xml:space="preserve">No aplicativo desktop, os dados financeiros são armazenados localmente em um banco de dados SQLite no dispositivo do usuário. Esses dados ficam sob controle exclusivo do usuário e não são acessados remotamente pela Lunaris Tech.</w:t>
+        <w:t xml:space="preserve">No aplicativo desktop, os dados financeiros são armazenados localmente em um banco de dados SQLite no dispositivo do usuário. Esses dados ficam sob controle exclusivo do usuário e não são acessados remotamente pela Lu System.</w:t>
       </w:r>
     </w:p>
     <w:p>
@@ -1778,7 +1778,7 @@
           <w:sz w:val="22"/>
           <w:szCs w:val="22"/>
         </w:rPr>
-        <w:t xml:space="preserve">A Lunaris Tech adota as seguintes medidas técnicas e organizacionais para proteger os dados dos usuários:</w:t>
+        <w:t xml:space="preserve">A Lu System adota as seguintes medidas técnicas e organizacionais para proteger os dados dos usuários:</w:t>
       </w:r>
     </w:p>
     <w:p>
@@ -1873,7 +1873,7 @@
           <w:sz w:val="22"/>
           <w:szCs w:val="22"/>
         </w:rPr>
-        <w:t xml:space="preserve">Nenhum funcionário da Lunaris Tech tem acesso rotineiro aos dados financeiros dos usuários.</w:t>
+        <w:t xml:space="preserve">Nenhum funcionário da Lu System tem acesso rotineiro aos dados financeiros dos usuários.</w:t>
       </w:r>
     </w:p>
     <w:p>
@@ -1905,7 +1905,7 @@
           <w:sz w:val="22"/>
           <w:szCs w:val="22"/>
         </w:rPr>
-        <w:t xml:space="preserve">A Lunaris Tech utiliza os seguintes serviços de terceiros no funcionamento do aplicativo:</w:t>
+        <w:t xml:space="preserve">A Lu System utiliza os seguintes serviços de terceiros no funcionamento do aplicativo:</w:t>
       </w:r>
     </w:p>
     <w:p>
@@ -2013,7 +2013,7 @@
           <w:sz w:val="22"/>
           <w:szCs w:val="22"/>
         </w:rPr>
-        <w:t xml:space="preserve">Os dados armazenados localmente (SQLite) no dispositivo do usuário são de responsabilidade exclusiva do usuário e não são excluídos remotamente pela Lunaris Tech. O usuário pode excluir o banco de dados local a qualquer momento desinstalando o aplicativo ou utilizando as ferramentas do sistema operacional.</w:t>
+        <w:t xml:space="preserve">Os dados armazenados localmente (SQLite) no dispositivo do usuário são de responsabilidade exclusiva do usuário e não são excluídos remotamente pela Lu System. O usuário pode excluir o banco de dados local a qualquer momento desinstalando o aplicativo ou utilizando as ferramentas do sistema operacional.</w:t>
       </w:r>
     </w:p>
     <w:p>
@@ -2064,7 +2064,7 @@
           <w:sz w:val="22"/>
           <w:szCs w:val="22"/>
         </w:rPr>
-        <w:t xml:space="preserve">Confirmação: saber se seus dados são tratados pela Lunaris Tech;</w:t>
+        <w:t xml:space="preserve">Confirmação: saber se seus dados são tratados pela Lu System;</w:t>
       </w:r>
     </w:p>
     <w:p>
@@ -2201,7 +2201,7 @@
           <w:sz w:val="22"/>
           <w:szCs w:val="22"/>
         </w:rPr>
-        <w:t xml:space="preserve">Para exercer qualquer um desses direitos, o usuário deve entrar em contato pelo e-mail lunaristech7@gmail.com, identificando-se e descrevendo a solicitação. A Lunaris Tech responderá em até 15 (quinze) dias úteis.</w:t>
+        <w:t xml:space="preserve">Para exercer qualquer um desses direitos, o usuário deve entrar em contato pelo e-mail contato@lusystem.com.br, identificando-se e descrevendo a solicitação. A Lu System responderá em até 15 (quinze) dias úteis.</w:t>
       </w:r>
     </w:p>
     <w:p>
@@ -2233,7 +2233,7 @@
           <w:sz w:val="22"/>
           <w:szCs w:val="22"/>
         </w:rPr>
-        <w:t xml:space="preserve">O Lunya não é direcionado a menores de 18 (dezoito) anos. Caso a Lunaris Tech tome conhecimento de que dados de menores foram coletados inadvertidamente, providenciará a exclusão imediata dessas informações.</w:t>
+        <w:t xml:space="preserve">O Lunya não é direcionado a menores de 18 (dezoito) anos. Caso a Lu System tome conhecimento de que dados de menores foram coletados inadvertidamente, providenciará a exclusão imediata dessas informações.</w:t>
       </w:r>
     </w:p>
     <w:p>
@@ -2344,7 +2344,7 @@
           <w:sz w:val="22"/>
           <w:szCs w:val="22"/>
         </w:rPr>
-        <w:t xml:space="preserve">A Lunaris Tech poderá atualizar esta Política de Privacidade periodicamente. Alterações relevantes serão comunicadas ao usuário por meio de aviso no aplicativo. A continuidade do uso após a publicação das alterações constitui aceite da Política revisada.</w:t>
+        <w:t xml:space="preserve">A Lu System poderá atualizar esta Política de Privacidade periodicamente. Alterações relevantes serão comunicadas ao usuário por meio de aviso no aplicativo. A continuidade do uso após a publicação das alterações constitui aceite da Política revisada.</w:t>
       </w:r>
     </w:p>
     <w:p>
@@ -2391,7 +2391,7 @@
           <w:sz w:val="22"/>
           <w:szCs w:val="22"/>
         </w:rPr>
-        <w:t xml:space="preserve">Em conformidade com a LGPD, o encarregado pelo tratamento de dados pessoais da Lunaris Tech pode ser contatado pelo seguinte canal:</w:t>
+        <w:t xml:space="preserve">Em conformidade com a LGPD, o encarregado pelo tratamento de dados pessoais da Lu System pode ser contatado pelo seguinte canal:</w:t>
       </w:r>
     </w:p>
     <w:p>
@@ -2416,7 +2416,7 @@
           <w:sz w:val="24"/>
           <w:szCs w:val="24"/>
         </w:rPr>
-        <w:t xml:space="preserve">lunaristech7@gmail.com</w:t>
+        <w:t xml:space="preserve">contato@lusystem.com.br</w:t>
       </w:r>
     </w:p>
     <w:p>
@@ -2460,7 +2460,7 @@
           <w:sz w:val="20"/>
           <w:szCs w:val="20"/>
         </w:rPr>
-        <w:t xml:space="preserve">Lunaris Tech  •  Lunya Finance</w:t>
+        <w:t xml:space="preserve">Lu System  •  Lunya Finance</w:t>
       </w:r>
     </w:p>
     <w:p>
@@ -2643,7 +2643,7 @@
         <w:sz w:val="18"/>
         <w:szCs w:val="18"/>
       </w:rPr>
-      <w:t xml:space="preserve">Lunaris Tech  |  Termos de Uso e Política de Privacidade  |  v1.0 — Maio 2026</w:t>
+      <w:t xml:space="preserve">Lu System  |  Termos de Uso e Política de Privacidade  |  v1.0 — Maio 2026</w:t>
     </w:r>
   </w:p>
 </w:hdr>

</xml_diff>